<commit_message>
minor changes to revised doc and removed the outdated one
</commit_message>
<xml_diff>
--- a/2B21-04_group_submission_revised.docx
+++ b/2B21-04_group_submission_revised.docx
@@ -194,15 +194,7 @@
           </w:tcPr>
           <w:p>
             <w:r>
-              <w:t xml:space="preserve">Kendrick </w:t>
-            </w:r>
-            <w:proofErr w:type="spellStart"/>
-            <w:r>
-              <w:t>Slamat</w:t>
-            </w:r>
-            <w:proofErr w:type="spellEnd"/>
-            <w:r>
-              <w:t xml:space="preserve"> </w:t>
+              <w:t xml:space="preserve">Kendrick Slamat </w:t>
             </w:r>
           </w:p>
         </w:tc>
@@ -2126,21 +2118,7 @@
               <w:rPr>
                 <w:sz w:val="18"/>
               </w:rPr>
-              <w:t xml:space="preserve">Invalid </w:t>
-            </w:r>
-            <w:proofErr w:type="spellStart"/>
-            <w:r>
-              <w:rPr>
-                <w:sz w:val="18"/>
-              </w:rPr>
-              <w:t>TierID</w:t>
-            </w:r>
-            <w:proofErr w:type="spellEnd"/>
-            <w:r>
-              <w:rPr>
-                <w:sz w:val="18"/>
-              </w:rPr>
-              <w:t xml:space="preserve"> 'T00001' (extra zero; no such tier exists)</w:t>
+              <w:t>Invalid TierID 'T00001' (extra zero; no such tier exists)</w:t>
             </w:r>
           </w:p>
         </w:tc>
@@ -2244,19 +2222,11 @@
             <w:tcW w:w="2700" w:type="dxa"/>
           </w:tcPr>
           <w:p>
-            <w:proofErr w:type="spellStart"/>
             <w:r>
               <w:rPr>
                 <w:sz w:val="18"/>
               </w:rPr>
-              <w:t>DateOfBirth</w:t>
-            </w:r>
-            <w:proofErr w:type="spellEnd"/>
-            <w:r>
-              <w:rPr>
-                <w:sz w:val="18"/>
-              </w:rPr>
-              <w:t xml:space="preserve"> stored as datetime '1990-05-08 00:00:00' instead of a date</w:t>
+              <w:t>DateOfBirth stored as datetime '1990-05-08 00:00:00' instead of a date</w:t>
             </w:r>
           </w:p>
         </w:tc>
@@ -2310,21 +2280,7 @@
               <w:rPr>
                 <w:sz w:val="18"/>
               </w:rPr>
-              <w:t>Two contact fields (</w:t>
-            </w:r>
-            <w:proofErr w:type="spellStart"/>
-            <w:r>
-              <w:rPr>
-                <w:sz w:val="18"/>
-              </w:rPr>
-              <w:t>ContactNo</w:t>
-            </w:r>
-            <w:proofErr w:type="spellEnd"/>
-            <w:r>
-              <w:rPr>
-                <w:sz w:val="18"/>
-              </w:rPr>
-              <w:t>, Email) but Member table has a single Contact column</w:t>
+              <w:t>Two contact fields (ContactNo, Email) but Member table has a single Contact column</w:t>
             </w:r>
           </w:p>
         </w:tc>
@@ -2592,16 +2548,8 @@
               <w:rPr>
                 <w:sz w:val="18"/>
               </w:rPr>
-              <w:t xml:space="preserve">data.xlsx / </w:t>
+              <w:t>data.xlsx / BookCopies</w:t>
             </w:r>
-            <w:proofErr w:type="spellStart"/>
-            <w:r>
-              <w:rPr>
-                <w:sz w:val="18"/>
-              </w:rPr>
-              <w:t>BookCopies</w:t>
-            </w:r>
-            <w:proofErr w:type="spellEnd"/>
           </w:p>
         </w:tc>
         <w:tc>
@@ -2626,21 +2574,7 @@
               <w:rPr>
                 <w:sz w:val="18"/>
               </w:rPr>
-              <w:t>Status misspelled as '</w:t>
-            </w:r>
-            <w:proofErr w:type="spellStart"/>
-            <w:r>
-              <w:rPr>
-                <w:sz w:val="18"/>
-              </w:rPr>
-              <w:t>Availble</w:t>
-            </w:r>
-            <w:proofErr w:type="spellEnd"/>
-            <w:r>
-              <w:rPr>
-                <w:sz w:val="18"/>
-              </w:rPr>
-              <w:t>'</w:t>
+              <w:t>Status misspelled as 'Availble'</w:t>
             </w:r>
           </w:p>
         </w:tc>
@@ -2668,16 +2602,8 @@
               <w:rPr>
                 <w:sz w:val="18"/>
               </w:rPr>
-              <w:t xml:space="preserve">data.xlsx / </w:t>
+              <w:t>data.xlsx / BookCopies</w:t>
             </w:r>
-            <w:proofErr w:type="spellStart"/>
-            <w:r>
-              <w:rPr>
-                <w:sz w:val="18"/>
-              </w:rPr>
-              <w:t>BookCopies</w:t>
-            </w:r>
-            <w:proofErr w:type="spellEnd"/>
           </w:p>
         </w:tc>
         <w:tc>
@@ -2756,63 +2682,7 @@
               <w:rPr>
                 <w:sz w:val="18"/>
               </w:rPr>
-              <w:t xml:space="preserve">Row references </w:t>
-            </w:r>
-            <w:proofErr w:type="spellStart"/>
-            <w:r>
-              <w:rPr>
-                <w:sz w:val="18"/>
-              </w:rPr>
-              <w:t>StaffID</w:t>
-            </w:r>
-            <w:proofErr w:type="spellEnd"/>
-            <w:r>
-              <w:rPr>
-                <w:sz w:val="18"/>
-              </w:rPr>
-              <w:t xml:space="preserve"> 'S0101' (staff run S0001-S0051) and </w:t>
-            </w:r>
-            <w:proofErr w:type="spellStart"/>
-            <w:r>
-              <w:rPr>
-                <w:sz w:val="18"/>
-              </w:rPr>
-              <w:t>CopySeqNo</w:t>
-            </w:r>
-            <w:proofErr w:type="spellEnd"/>
-            <w:r>
-              <w:rPr>
-                <w:sz w:val="18"/>
-              </w:rPr>
-              <w:t xml:space="preserve"> 8 (book has 3 copies); </w:t>
-            </w:r>
-            <w:proofErr w:type="spellStart"/>
-            <w:r>
-              <w:rPr>
-                <w:sz w:val="18"/>
-              </w:rPr>
-              <w:t>DueDate</w:t>
-            </w:r>
-            <w:proofErr w:type="spellEnd"/>
-            <w:r>
-              <w:rPr>
-                <w:sz w:val="18"/>
-              </w:rPr>
-              <w:t xml:space="preserve"> 2023-04-02 precedes </w:t>
-            </w:r>
-            <w:proofErr w:type="spellStart"/>
-            <w:r>
-              <w:rPr>
-                <w:sz w:val="18"/>
-              </w:rPr>
-              <w:t>LoanDatetime</w:t>
-            </w:r>
-            <w:proofErr w:type="spellEnd"/>
-            <w:r>
-              <w:rPr>
-                <w:sz w:val="18"/>
-              </w:rPr>
-              <w:t xml:space="preserve"> 2024-07-04</w:t>
+              <w:t>Row references StaffID 'S0101' (staff run S0001-S0051) and CopySeqNo 8 (book has 3 copies); DueDate 2023-04-02 precedes LoanDatetime 2024-07-04</w:t>
             </w:r>
           </w:p>
         </w:tc>
@@ -2830,96 +2700,6 @@
           </w:p>
         </w:tc>
       </w:tr>
-      <w:tr>
-        <w:tc>
-          <w:tcPr>
-            <w:tcW w:w="1705" w:type="dxa"/>
-          </w:tcPr>
-          <w:p>
-            <w:r>
-              <w:rPr>
-                <w:sz w:val="18"/>
-              </w:rPr>
-              <w:t>data.xlsx / Loans</w:t>
-            </w:r>
-          </w:p>
-        </w:tc>
-        <w:tc>
-          <w:tcPr>
-            <w:tcW w:w="1620" w:type="dxa"/>
-          </w:tcPr>
-          <w:p>
-            <w:r>
-              <w:rPr>
-                <w:sz w:val="18"/>
-              </w:rPr>
-              <w:t>7 rows</w:t>
-            </w:r>
-          </w:p>
-        </w:tc>
-        <w:tc>
-          <w:tcPr>
-            <w:tcW w:w="2700" w:type="dxa"/>
-          </w:tcPr>
-          <w:p>
-            <w:r>
-              <w:rPr>
-                <w:sz w:val="18"/>
-              </w:rPr>
-              <w:t xml:space="preserve">Missing </w:t>
-            </w:r>
-            <w:proofErr w:type="spellStart"/>
-            <w:r>
-              <w:rPr>
-                <w:sz w:val="18"/>
-              </w:rPr>
-              <w:t>LoanStatus</w:t>
-            </w:r>
-            <w:proofErr w:type="spellEnd"/>
-            <w:r>
-              <w:rPr>
-                <w:sz w:val="18"/>
-              </w:rPr>
-              <w:t xml:space="preserve"> (6 returned, 1 outstanding)</w:t>
-            </w:r>
-          </w:p>
-        </w:tc>
-        <w:tc>
-          <w:tcPr>
-            <w:tcW w:w="2994" w:type="dxa"/>
-          </w:tcPr>
-          <w:p>
-            <w:r>
-              <w:rPr>
-                <w:sz w:val="18"/>
-              </w:rPr>
-              <w:t xml:space="preserve">No correction needed for insertion: </w:t>
-            </w:r>
-            <w:proofErr w:type="spellStart"/>
-            <w:r>
-              <w:rPr>
-                <w:sz w:val="18"/>
-              </w:rPr>
-              <w:t>LoanStatus</w:t>
-            </w:r>
-            <w:proofErr w:type="spellEnd"/>
-            <w:r>
-              <w:rPr>
-                <w:sz w:val="18"/>
-              </w:rPr>
-              <w:t xml:space="preserve"> is not a column in the Loan table; status is derivable from </w:t>
-            </w:r>
-            <w:proofErr w:type="spellStart"/>
-            <w:r>
-              <w:rPr>
-                <w:sz w:val="18"/>
-              </w:rPr>
-              <w:t>ReturnDatetime</w:t>
-            </w:r>
-            <w:proofErr w:type="spellEnd"/>
-          </w:p>
-        </w:tc>
-      </w:tr>
     </w:tbl>
     <w:p>
       <w:pPr>
@@ -2931,15 +2711,7 @@
         <w:pStyle w:val="ListParagraph"/>
       </w:pPr>
       <w:r>
-        <w:t xml:space="preserve">Submit your SQL INSERT statements for data insertion to the OLTP tables in </w:t>
-      </w:r>
-      <w:proofErr w:type="spellStart"/>
-      <w:r>
-        <w:t>OLTP_insert.sql</w:t>
-      </w:r>
-      <w:proofErr w:type="spellEnd"/>
-      <w:r>
-        <w:t>. If you apply bulk loading, submit each of the cleaned data files used during insertion as well.</w:t>
+        <w:t>Submit your SQL INSERT statements for data insertion to the OLTP tables in OLTP_insert.sql. If you apply bulk loading, submit each of the cleaned data files used during insertion as well.</w:t>
       </w:r>
     </w:p>
     <w:p>
@@ -3101,63 +2873,7 @@
         </w:rPr>
       </w:pPr>
       <w:r>
-        <w:t xml:space="preserve">To support the required analysis, we used a star schema </w:t>
-      </w:r>
-      <w:proofErr w:type="spellStart"/>
-      <w:r>
-        <w:t>centred</w:t>
-      </w:r>
-      <w:proofErr w:type="spellEnd"/>
-      <w:r>
-        <w:t xml:space="preserve"> on </w:t>
-      </w:r>
-      <w:proofErr w:type="spellStart"/>
-      <w:r>
-        <w:t>FactLoan</w:t>
-      </w:r>
-      <w:proofErr w:type="spellEnd"/>
-      <w:r>
-        <w:t xml:space="preserve">. Its grain is one completed loan: one physical book copy borrowed by one member and returned. </w:t>
-      </w:r>
-      <w:proofErr w:type="spellStart"/>
-      <w:r>
-        <w:t>FactLoan</w:t>
-      </w:r>
-      <w:proofErr w:type="spellEnd"/>
-      <w:r>
-        <w:t xml:space="preserve"> links once to each of four dimensions: </w:t>
-      </w:r>
-      <w:proofErr w:type="spellStart"/>
-      <w:r>
-        <w:t>DimMember</w:t>
-      </w:r>
-      <w:proofErr w:type="spellEnd"/>
-      <w:r>
-        <w:t xml:space="preserve">, </w:t>
-      </w:r>
-      <w:proofErr w:type="spellStart"/>
-      <w:r>
-        <w:t>DimStaff</w:t>
-      </w:r>
-      <w:proofErr w:type="spellEnd"/>
-      <w:r>
-        <w:t xml:space="preserve">, </w:t>
-      </w:r>
-      <w:proofErr w:type="spellStart"/>
-      <w:r>
-        <w:t>DimBook</w:t>
-      </w:r>
-      <w:proofErr w:type="spellEnd"/>
-      <w:r>
-        <w:t xml:space="preserve"> and </w:t>
-      </w:r>
-      <w:proofErr w:type="spellStart"/>
-      <w:r>
-        <w:t>DimDate</w:t>
-      </w:r>
-      <w:proofErr w:type="spellEnd"/>
-      <w:r>
-        <w:t>.</w:t>
+        <w:t>To support the required analysis, we used a star schema centred on FactLoan. Its grain is one completed loan: one physical book copy borrowed by one member and returned. FactLoan links once to each of four dimensions: DimMember, DimStaff, DimBook and DimDate.</w:t>
       </w:r>
     </w:p>
     <w:p>
@@ -3174,71 +2890,7 @@
         </w:rPr>
       </w:pPr>
       <w:r>
-        <w:t xml:space="preserve">Every table, including </w:t>
-      </w:r>
-      <w:proofErr w:type="spellStart"/>
-      <w:r>
-        <w:t>FactLoan</w:t>
-      </w:r>
-      <w:proofErr w:type="spellEnd"/>
-      <w:r>
-        <w:t xml:space="preserve"> and </w:t>
-      </w:r>
-      <w:proofErr w:type="spellStart"/>
-      <w:r>
-        <w:t>DimDate</w:t>
-      </w:r>
-      <w:proofErr w:type="spellEnd"/>
-      <w:r>
-        <w:t xml:space="preserve">, uses an AUTO_INCREMENT surrogate key. </w:t>
-      </w:r>
-      <w:proofErr w:type="spellStart"/>
-      <w:r>
-        <w:t>DimMember</w:t>
-      </w:r>
-      <w:proofErr w:type="spellEnd"/>
-      <w:r>
-        <w:t xml:space="preserve"> stores the member's current </w:t>
-      </w:r>
-      <w:proofErr w:type="spellStart"/>
-      <w:r>
-        <w:t>TierName</w:t>
-      </w:r>
-      <w:proofErr w:type="spellEnd"/>
-      <w:r>
-        <w:t xml:space="preserve">, </w:t>
-      </w:r>
-      <w:proofErr w:type="spellStart"/>
-      <w:r>
-        <w:t>TierLevel</w:t>
-      </w:r>
-      <w:proofErr w:type="spellEnd"/>
-      <w:r>
-        <w:t xml:space="preserve"> and </w:t>
-      </w:r>
-      <w:proofErr w:type="spellStart"/>
-      <w:r>
-        <w:t>BorrowLimit</w:t>
-      </w:r>
-      <w:proofErr w:type="spellEnd"/>
-      <w:r>
-        <w:t xml:space="preserve">, while </w:t>
-      </w:r>
-      <w:proofErr w:type="spellStart"/>
-      <w:r>
-        <w:t>DimBook</w:t>
-      </w:r>
-      <w:proofErr w:type="spellEnd"/>
-      <w:r>
-        <w:t xml:space="preserve"> stores the minimum tier needed to borrow each book. These </w:t>
-      </w:r>
-      <w:proofErr w:type="spellStart"/>
-      <w:r>
-        <w:t>denormalised</w:t>
-      </w:r>
-      <w:proofErr w:type="spellEnd"/>
-      <w:r>
-        <w:t xml:space="preserve"> attributes keep the model in star form and reduce joins in analytical queries.</w:t>
+        <w:t>Every table, including FactLoan and DimDate, uses an AUTO_INCREMENT surrogate key. DimMember stores the member's current TierName, TierLevel and BorrowLimit, while DimBook stores the minimum tier needed to borrow each book. These denormalised attributes keep the model in star form and reduce joins in analytical queries.</w:t>
       </w:r>
     </w:p>
     <w:p>
@@ -3254,70 +2906,9 @@
           <w:lang w:val="en-SG"/>
         </w:rPr>
       </w:pPr>
-      <w:proofErr w:type="spellStart"/>
       <w:r>
         <w:lastRenderedPageBreak/>
-        <w:t>DimDate</w:t>
-      </w:r>
-      <w:proofErr w:type="spellEnd"/>
-      <w:r>
-        <w:t xml:space="preserve"> has day-level granularity and includes </w:t>
-      </w:r>
-      <w:proofErr w:type="spellStart"/>
-      <w:r>
-        <w:t>FullDate</w:t>
-      </w:r>
-      <w:proofErr w:type="spellEnd"/>
-      <w:r>
-        <w:t xml:space="preserve">, day of week, weekend indicator, month, quarter and year. </w:t>
-      </w:r>
-      <w:proofErr w:type="spellStart"/>
-      <w:r>
-        <w:t>FactLoan</w:t>
-      </w:r>
-      <w:proofErr w:type="spellEnd"/>
-      <w:r>
-        <w:t xml:space="preserve"> references </w:t>
-      </w:r>
-      <w:proofErr w:type="spellStart"/>
-      <w:r>
-        <w:t>DimDate</w:t>
-      </w:r>
-      <w:proofErr w:type="spellEnd"/>
-      <w:r>
-        <w:t xml:space="preserve"> once through </w:t>
-      </w:r>
-      <w:proofErr w:type="spellStart"/>
-      <w:r>
-        <w:t>BorrowDateKey</w:t>
-      </w:r>
-      <w:proofErr w:type="spellEnd"/>
-      <w:r>
-        <w:t xml:space="preserve">, which records when the loan began. Return-related analysis is supported by </w:t>
-      </w:r>
-      <w:proofErr w:type="spellStart"/>
-      <w:r>
-        <w:t>LoanDurationDays</w:t>
-      </w:r>
-      <w:proofErr w:type="spellEnd"/>
-      <w:r>
-        <w:t xml:space="preserve">, </w:t>
-      </w:r>
-      <w:proofErr w:type="spellStart"/>
-      <w:r>
-        <w:t>DaysBeforeDue</w:t>
-      </w:r>
-      <w:proofErr w:type="spellEnd"/>
-      <w:r>
-        <w:t xml:space="preserve"> and </w:t>
-      </w:r>
-      <w:proofErr w:type="spellStart"/>
-      <w:r>
-        <w:t>IsLate</w:t>
-      </w:r>
-      <w:proofErr w:type="spellEnd"/>
-      <w:r>
-        <w:t xml:space="preserve"> instead of a second date-dimension relationship, so the model matches the ERD and remains easy to interpret.</w:t>
+        <w:t>DimDate has day-level granularity and includes FullDate, day of week, weekend indicator, month, quarter and year. FactLoan references DimDate once through BorrowDateKey, which records when the loan began. Return-related analysis is supported by LoanDurationDays, DaysBeforeDue and IsLate instead of a second date-dimension relationship, so the model matches the ERD and remains easy to interpret.</w:t>
       </w:r>
     </w:p>
     <w:p>
@@ -3326,21 +2917,8 @@
           <w:lang w:val="en-SG"/>
         </w:rPr>
       </w:pPr>
-      <w:proofErr w:type="spellStart"/>
       <w:r>
-        <w:t>CopySeqNo</w:t>
-      </w:r>
-      <w:proofErr w:type="spellEnd"/>
-      <w:r>
-        <w:t xml:space="preserve"> is kept in </w:t>
-      </w:r>
-      <w:proofErr w:type="spellStart"/>
-      <w:r>
-        <w:t>FactLoan</w:t>
-      </w:r>
-      <w:proofErr w:type="spellEnd"/>
-      <w:r>
-        <w:t xml:space="preserve"> as a degenerate dimension. It identifies the physical copy involved in each loan and preserves traceability to the operational system without adding a separate, low-value dimension table.</w:t>
+        <w:t>CopySeqNo is kept in FactLoan as a degenerate dimension. It identifies the physical copy involved in each loan and preserves traceability to the operational system without adding a separate, low-value dimension table.</w:t>
       </w:r>
     </w:p>
     <w:p>
@@ -3357,31 +2935,7 @@
         </w:rPr>
       </w:pPr>
       <w:r>
-        <w:t xml:space="preserve">During the load, </w:t>
-      </w:r>
-      <w:proofErr w:type="spellStart"/>
-      <w:r>
-        <w:t>LoanDurationDays</w:t>
-      </w:r>
-      <w:proofErr w:type="spellEnd"/>
-      <w:r>
-        <w:t xml:space="preserve"> is calculated as the difference between the borrow and return dates. </w:t>
-      </w:r>
-      <w:proofErr w:type="spellStart"/>
-      <w:r>
-        <w:t>DaysBeforeDue</w:t>
-      </w:r>
-      <w:proofErr w:type="spellEnd"/>
-      <w:r>
-        <w:t xml:space="preserve"> is due date minus return date, so a negative result indicates a late return. </w:t>
-      </w:r>
-      <w:proofErr w:type="spellStart"/>
-      <w:r>
-        <w:t>IsLate</w:t>
-      </w:r>
-      <w:proofErr w:type="spellEnd"/>
-      <w:r>
-        <w:t xml:space="preserve"> is stored as a clear Boolean flag. Persisting these measures keeps later analyses consistent and avoids repeating calculations in every query.</w:t>
+        <w:t>During the load, LoanDurationDays is calculated as the difference between the borrow and return dates. DaysBeforeDue is due date minus return date, so a negative result indicates a late return. IsLate is stored as a clear Boolean flag. Persisting these measures keeps later analyses consistent and avoids repeating calculations in every query.</w:t>
       </w:r>
     </w:p>
     <w:p>
@@ -3390,21 +2944,8 @@
           <w:lang w:val="en-SG"/>
         </w:rPr>
       </w:pPr>
-      <w:proofErr w:type="spellStart"/>
       <w:r>
-        <w:t>FactLoan</w:t>
-      </w:r>
-      <w:proofErr w:type="spellEnd"/>
-      <w:r>
-        <w:t xml:space="preserve"> contains only completed loans because the project's analytical focus is borrowing activity and duration for books that have been returned; the single open loan is excluded. Slowly changing dimensions are outside scope. If membership-tier history is required later, </w:t>
-      </w:r>
-      <w:proofErr w:type="spellStart"/>
-      <w:r>
-        <w:t>DimMember</w:t>
-      </w:r>
-      <w:proofErr w:type="spellEnd"/>
-      <w:r>
-        <w:t xml:space="preserve"> can be extended to a Type 2 slowly changing dimension with effective-date, expiry-date and current-row attributes.</w:t>
+        <w:t>FactLoan contains only completed loans because the project's analytical focus is borrowing activity and duration for books that have been returned; the single open loan is excluded. Slowly changing dimensions are outside scope. If membership-tier history is required later, DimMember can be extended to a Type 2 slowly changing dimension with effective-date, expiry-date and current-row attributes.</w:t>
       </w:r>
     </w:p>
     <w:p>
@@ -3422,29 +2963,13 @@
       </w:pPr>
       <w:r>
         <w:lastRenderedPageBreak/>
-        <w:t xml:space="preserve">Submit your CREATE table statements for DW table creations in </w:t>
-      </w:r>
-      <w:proofErr w:type="spellStart"/>
-      <w:r>
-        <w:t>DW_create.sql</w:t>
-      </w:r>
-      <w:proofErr w:type="spellEnd"/>
-      <w:r>
-        <w:t xml:space="preserve">. Use appropriate SQL statements to extract and load data from OLTP tables to the </w:t>
+        <w:t xml:space="preserve">Submit your CREATE table statements for DW table creations in DW_create.sql. Use appropriate SQL statements to extract and load data from OLTP tables to the </w:t>
       </w:r>
       <w:r>
         <w:t>DW and</w:t>
       </w:r>
       <w:r>
-        <w:t xml:space="preserve"> submit all your queries in </w:t>
-      </w:r>
-      <w:proofErr w:type="spellStart"/>
-      <w:r>
-        <w:t>DW_insert.sql</w:t>
-      </w:r>
-      <w:proofErr w:type="spellEnd"/>
-      <w:r>
-        <w:t>.</w:t>
+        <w:t xml:space="preserve"> submit all your queries in DW_insert.sql.</w:t>
       </w:r>
     </w:p>
     <w:bookmarkEnd w:id="1"/>
@@ -3608,45 +3133,8 @@
         </w:rPr>
         <w:t xml:space="preserve">Row-count reconciliation. </w:t>
       </w:r>
-      <w:proofErr w:type="spellStart"/>
       <w:r>
-        <w:t>FactLoan</w:t>
-      </w:r>
-      <w:proofErr w:type="spellEnd"/>
-      <w:r>
-        <w:t xml:space="preserve"> contains 12,343 rows, exactly matching the number of completed Loan records in the OLTP database. The dimension counts also reconcile to their source entities: </w:t>
-      </w:r>
-      <w:proofErr w:type="spellStart"/>
-      <w:r>
-        <w:t>DimMember</w:t>
-      </w:r>
-      <w:proofErr w:type="spellEnd"/>
-      <w:r>
-        <w:t xml:space="preserve"> 301/Member 301, </w:t>
-      </w:r>
-      <w:proofErr w:type="spellStart"/>
-      <w:r>
-        <w:t>DimBook</w:t>
-      </w:r>
-      <w:proofErr w:type="spellEnd"/>
-      <w:r>
-        <w:t xml:space="preserve"> 500/Book 500 and </w:t>
-      </w:r>
-      <w:proofErr w:type="spellStart"/>
-      <w:r>
-        <w:t>DimStaff</w:t>
-      </w:r>
-      <w:proofErr w:type="spellEnd"/>
-      <w:r>
-        <w:t xml:space="preserve"> 51/Staff 51. </w:t>
-      </w:r>
-      <w:proofErr w:type="spellStart"/>
-      <w:r>
-        <w:t>DimDate</w:t>
-      </w:r>
-      <w:proofErr w:type="spellEnd"/>
-      <w:r>
-        <w:t xml:space="preserve"> contains 2,557 day-level rows. Matching counts confirm that the intended records were loaded without omission or duplication.</w:t>
+        <w:t>FactLoan contains 12,343 rows, exactly matching the number of completed Loan records in the OLTP database. The dimension counts also reconcile to their source entities: DimMember 301/Member 301, DimBook 500/Book 500 and DimStaff 51/Staff 51. DimDate contains 2,557 day-level rows. Matching counts confirm that the intended records were loaded without omission or duplication.</w:t>
       </w:r>
     </w:p>
     <w:p>
@@ -3662,23 +3150,7 @@
         <w:t xml:space="preserve">Measure reconciliation. </w:t>
       </w:r>
       <w:r>
-        <w:t xml:space="preserve">The total loan duration calculated directly from completed OLTP loans is 108,801 days, exactly the same as the total </w:t>
-      </w:r>
-      <w:proofErr w:type="spellStart"/>
-      <w:r>
-        <w:t>LoanDurationDays</w:t>
-      </w:r>
-      <w:proofErr w:type="spellEnd"/>
-      <w:r>
-        <w:t xml:space="preserve"> stored in </w:t>
-      </w:r>
-      <w:proofErr w:type="spellStart"/>
-      <w:r>
-        <w:t>FactLoan</w:t>
-      </w:r>
-      <w:proofErr w:type="spellEnd"/>
-      <w:r>
-        <w:t>. This confirms that the duration transformation was applied consistently to every loaded fact.</w:t>
+        <w:t>The total loan duration calculated directly from completed OLTP loans is 108,801 days, exactly the same as the total LoanDurationDays stored in FactLoan. This confirms that the duration transformation was applied consistently to every loaded fact.</w:t>
       </w:r>
     </w:p>
     <w:p>
@@ -3689,27 +3161,11 @@
         <w:t xml:space="preserve">Referential-integrity and date-range checks. </w:t>
       </w:r>
       <w:r>
-        <w:t xml:space="preserve">A left-join validation across </w:t>
-      </w:r>
-      <w:proofErr w:type="spellStart"/>
-      <w:r>
-        <w:t>FactLoan</w:t>
-      </w:r>
-      <w:proofErr w:type="spellEnd"/>
-      <w:r>
-        <w:t xml:space="preserve"> and all four dimensions returns 0 orphan rows, confirming every fact points to a valid member, staff member, </w:t>
+        <w:t xml:space="preserve">A left-join validation across FactLoan and all four dimensions returns 0 orphan rows, confirming every fact points to a valid member, staff member, </w:t>
       </w:r>
       <w:r>
         <w:lastRenderedPageBreak/>
-        <w:t xml:space="preserve">book and borrow date. </w:t>
-      </w:r>
-      <w:proofErr w:type="spellStart"/>
-      <w:r>
-        <w:t>DimDate</w:t>
-      </w:r>
-      <w:proofErr w:type="spellEnd"/>
-      <w:r>
-        <w:t xml:space="preserve"> runs from 2020-01-01 to 2026-12-31, covering the dates required by the load. Together, these checks validate record completeness, transformed measures and dimension-key integrity. The verification SQL is included in the submitted DW scripts.</w:t>
+        <w:t>book and borrow date. DimDate runs from 2020-01-01 to 2026-12-31, covering the dates required by the load. Together, these checks validate record completeness, transformed measures and dimension-key integrity. The verification SQL is included in the submitted DW scripts.</w:t>
       </w:r>
     </w:p>
     <w:bookmarkEnd w:id="0"/>
@@ -3731,6 +3187,10 @@
     <w:p>
       <w:pPr>
         <w:pStyle w:val="ListParagraph"/>
+        <w:numPr>
+          <w:ilvl w:val="0"/>
+          <w:numId w:val="45"/>
+        </w:numPr>
       </w:pPr>
       <w:r>
         <w:t xml:space="preserve">Describe and discuss your analysis done using the DW. </w:t>
@@ -3760,15 +3220,7 @@
         <w:t xml:space="preserve"> if group size is 4.</w:t>
       </w:r>
       <w:r>
-        <w:t xml:space="preserve"> Separately submit all your queries in </w:t>
-      </w:r>
-      <w:proofErr w:type="spellStart"/>
-      <w:r>
-        <w:t>DW_query.sql</w:t>
-      </w:r>
-      <w:proofErr w:type="spellEnd"/>
-      <w:r>
-        <w:t xml:space="preserve">. (So do not include </w:t>
+        <w:t xml:space="preserve"> Separately submit all your queries in DW_query.sql. (So do not include </w:t>
       </w:r>
       <w:r>
         <w:t>your</w:t>
@@ -3815,13 +3267,8 @@
         </w:rPr>
         <w:t xml:space="preserve">Objective: </w:t>
       </w:r>
-      <w:proofErr w:type="spellStart"/>
       <w:r>
-        <w:t>Analyse</w:t>
-      </w:r>
-      <w:proofErr w:type="spellEnd"/>
-      <w:r>
-        <w:t xml:space="preserve"> completed-loan volume by month and </w:t>
+        <w:t xml:space="preserve">Analyse completed-loan volume by month and </w:t>
       </w:r>
       <w:r>
         <w:t>year and</w:t>
@@ -4163,15 +3610,7 @@
         <w:t xml:space="preserve">Insight: </w:t>
       </w:r>
       <w:r>
-        <w:t xml:space="preserve">In this dataset, higher-tier members keep books slightly longer but have lower late-return rates. This is an association, not proof that tier causes return </w:t>
-      </w:r>
-      <w:proofErr w:type="spellStart"/>
-      <w:r>
-        <w:t>behaviour</w:t>
-      </w:r>
-      <w:proofErr w:type="spellEnd"/>
-      <w:r>
-        <w:t>. Reminders and late-return interventions would have the greatest effect when directed at Basic members.</w:t>
+        <w:t>In this dataset, higher-tier members keep books slightly longer but have lower late-return rates. This is an association, not proof that tier causes return behaviour. Reminders and late-return interventions would have the greatest effect when directed at Basic members.</w:t>
       </w:r>
     </w:p>
     <w:p>
@@ -4249,15 +3688,7 @@
         <w:t xml:space="preserve">Insight: </w:t>
       </w:r>
       <w:r>
-        <w:t xml:space="preserve">Youth borrowing is strongly seasonal and is concentrated in the November-December school-holiday period. The library should schedule </w:t>
-      </w:r>
-      <w:proofErr w:type="spellStart"/>
-      <w:r>
-        <w:t>programmes</w:t>
-      </w:r>
-      <w:proofErr w:type="spellEnd"/>
-      <w:r>
-        <w:t>, acquisitions and extra copies of popular youth titles before the fourth quarter.</w:t>
+        <w:t>Youth borrowing is strongly seasonal and is concentrated in the November-December school-holiday period. The library should schedule programmes, acquisitions and extra copies of popular youth titles before the fourth quarter.</w:t>
       </w:r>
     </w:p>
     <w:p>
@@ -11961,23 +11392,6 @@
 </file>
 
 <file path=customXml/item2.xml><?xml version="1.0" encoding="utf-8"?>
-<p:properties xmlns:p="http://schemas.microsoft.com/office/2006/metadata/properties" xmlns:xsi="http://www.w3.org/2001/XMLSchema-instance" xmlns:pc="http://schemas.microsoft.com/office/infopath/2007/PartnerControls">
-  <documentManagement>
-    <_ip_UnifiedCompliancePolicyUIAction xmlns="http://schemas.microsoft.com/sharepoint/v3" xsi:nil="true"/>
-    <lcf76f155ced4ddcb4097134ff3c332f xmlns="72f5c66d-4f9b-4523-9c59-0147434cba56">
-      <Terms xmlns="http://schemas.microsoft.com/office/infopath/2007/PartnerControls"/>
-    </lcf76f155ced4ddcb4097134ff3c332f>
-    <TaxCatchAll xmlns="d5671106-6e7e-4942-8aee-9bcd5dd7e66b" xsi:nil="true"/>
-    <_ip_UnifiedCompliancePolicyProperties xmlns="http://schemas.microsoft.com/sharepoint/v3" xsi:nil="true"/>
-  </documentManagement>
-</p:properties>
-</file>
-
-<file path=customXml/item3.xml><?xml version="1.0" encoding="utf-8"?>
-<b:Sources xmlns:b="http://schemas.openxmlformats.org/officeDocument/2006/bibliography" xmlns="http://schemas.openxmlformats.org/officeDocument/2006/bibliography" SelectedStyle="\MLA.XSL" StyleName="MLA"/>
-</file>
-
-<file path=customXml/item4.xml><?xml version="1.0" encoding="utf-8"?>
 <ct:contentTypeSchema xmlns:ct="http://schemas.microsoft.com/office/2006/metadata/contentType" xmlns:ma="http://schemas.microsoft.com/office/2006/metadata/properties/metaAttributes" ct:_="" ma:_="" ma:contentTypeName="Document" ma:contentTypeID="0x01010088CE47F754C76E4E816A66E05339225A" ma:contentTypeVersion="13" ma:contentTypeDescription="Create a new document." ma:contentTypeScope="" ma:versionID="076a7d54fdb0b635cd2e2f75f54c1b16">
   <xsd:schema xmlns:xsd="http://www.w3.org/2001/XMLSchema" xmlns:xs="http://www.w3.org/2001/XMLSchema" xmlns:p="http://schemas.microsoft.com/office/2006/metadata/properties" xmlns:ns1="http://schemas.microsoft.com/sharepoint/v3" xmlns:ns2="72f5c66d-4f9b-4523-9c59-0147434cba56" xmlns:ns3="d5671106-6e7e-4942-8aee-9bcd5dd7e66b" targetNamespace="http://schemas.microsoft.com/office/2006/metadata/properties" ma:root="true" ma:fieldsID="733d59cbe7e7cf634dfb746df9f4de01" ns1:_="" ns2:_="" ns3:_="">
     <xsd:import namespace="http://schemas.microsoft.com/sharepoint/v3"/>
@@ -12189,6 +11603,23 @@
 </ct:contentTypeSchema>
 </file>
 
+<file path=customXml/item3.xml><?xml version="1.0" encoding="utf-8"?>
+<b:Sources xmlns:b="http://schemas.openxmlformats.org/officeDocument/2006/bibliography" xmlns="http://schemas.openxmlformats.org/officeDocument/2006/bibliography" SelectedStyle="\MLA.XSL" StyleName="MLA"/>
+</file>
+
+<file path=customXml/item4.xml><?xml version="1.0" encoding="utf-8"?>
+<p:properties xmlns:p="http://schemas.microsoft.com/office/2006/metadata/properties" xmlns:xsi="http://www.w3.org/2001/XMLSchema-instance" xmlns:pc="http://schemas.microsoft.com/office/infopath/2007/PartnerControls">
+  <documentManagement>
+    <_ip_UnifiedCompliancePolicyUIAction xmlns="http://schemas.microsoft.com/sharepoint/v3" xsi:nil="true"/>
+    <lcf76f155ced4ddcb4097134ff3c332f xmlns="72f5c66d-4f9b-4523-9c59-0147434cba56">
+      <Terms xmlns="http://schemas.microsoft.com/office/infopath/2007/PartnerControls"/>
+    </lcf76f155ced4ddcb4097134ff3c332f>
+    <TaxCatchAll xmlns="d5671106-6e7e-4942-8aee-9bcd5dd7e66b" xsi:nil="true"/>
+    <_ip_UnifiedCompliancePolicyProperties xmlns="http://schemas.microsoft.com/sharepoint/v3" xsi:nil="true"/>
+  </documentManagement>
+</p:properties>
+</file>
+
 <file path=customXml/itemProps1.xml><?xml version="1.0" encoding="utf-8"?>
 <ds:datastoreItem xmlns:ds="http://schemas.openxmlformats.org/officeDocument/2006/customXml" ds:itemID="{C793F174-B33D-4AAE-9E3B-9A362A6F4892}">
   <ds:schemaRefs>
@@ -12198,26 +11629,6 @@
 </file>
 
 <file path=customXml/itemProps2.xml><?xml version="1.0" encoding="utf-8"?>
-<ds:datastoreItem xmlns:ds="http://schemas.openxmlformats.org/officeDocument/2006/customXml" ds:itemID="{2FE68222-D1D7-4405-9D8B-445901EEA94E}">
-  <ds:schemaRefs>
-    <ds:schemaRef ds:uri="http://schemas.microsoft.com/office/2006/metadata/properties"/>
-    <ds:schemaRef ds:uri="http://schemas.microsoft.com/office/infopath/2007/PartnerControls"/>
-    <ds:schemaRef ds:uri="http://schemas.microsoft.com/sharepoint/v3"/>
-    <ds:schemaRef ds:uri="72f5c66d-4f9b-4523-9c59-0147434cba56"/>
-    <ds:schemaRef ds:uri="d5671106-6e7e-4942-8aee-9bcd5dd7e66b"/>
-  </ds:schemaRefs>
-</ds:datastoreItem>
-</file>
-
-<file path=customXml/itemProps3.xml><?xml version="1.0" encoding="utf-8"?>
-<ds:datastoreItem xmlns:ds="http://schemas.openxmlformats.org/officeDocument/2006/customXml" ds:itemID="{6A404842-743E-4BBC-99A7-70A911F17733}">
-  <ds:schemaRefs>
-    <ds:schemaRef ds:uri="http://schemas.openxmlformats.org/officeDocument/2006/bibliography"/>
-  </ds:schemaRefs>
-</ds:datastoreItem>
-</file>
-
-<file path=customXml/itemProps4.xml><?xml version="1.0" encoding="utf-8"?>
 <ds:datastoreItem xmlns:ds="http://schemas.openxmlformats.org/officeDocument/2006/customXml" ds:itemID="{77819383-3D86-46CF-A5E7-D6F9C756A7E0}">
   <ds:schemaRefs>
     <ds:schemaRef ds:uri="http://schemas.microsoft.com/office/2006/metadata/contentType"/>
@@ -12235,4 +11646,24 @@
     <ds:schemaRef ds:uri="http://schemas.microsoft.com/internal/obd"/>
   </ds:schemaRefs>
 </ds:datastoreItem>
+</file>
+
+<file path=customXml/itemProps3.xml><?xml version="1.0" encoding="utf-8"?>
+<ds:datastoreItem xmlns:ds="http://schemas.openxmlformats.org/officeDocument/2006/customXml" ds:itemID="{6A404842-743E-4BBC-99A7-70A911F17733}">
+  <ds:schemaRefs>
+    <ds:schemaRef ds:uri="http://schemas.openxmlformats.org/officeDocument/2006/bibliography"/>
+  </ds:schemaRefs>
+</ds:datastoreItem>
+</file>
+
+<file path=customXml/itemProps4.xml><?xml version="1.0" encoding="utf-8"?>
+<ds:datastoreItem xmlns:ds="http://schemas.openxmlformats.org/officeDocument/2006/customXml" ds:itemID="{2FE68222-D1D7-4405-9D8B-445901EEA94E}">
+  <ds:schemaRefs>
+    <ds:schemaRef ds:uri="http://schemas.microsoft.com/office/2006/metadata/properties"/>
+    <ds:schemaRef ds:uri="http://schemas.microsoft.com/office/infopath/2007/PartnerControls"/>
+    <ds:schemaRef ds:uri="http://schemas.microsoft.com/sharepoint/v3"/>
+    <ds:schemaRef ds:uri="72f5c66d-4f9b-4523-9c59-0147434cba56"/>
+    <ds:schemaRef ds:uri="d5671106-6e7e-4942-8aee-9bcd5dd7e66b"/>
+  </ds:schemaRefs>
+</ds:datastoreItem>
 </file>
</xml_diff>

<commit_message>
some changes to wrod doc ig
</commit_message>
<xml_diff>
--- a/2B21-04_group_submission_revised.docx
+++ b/2B21-04_group_submission_revised.docx
@@ -194,7 +194,15 @@
           </w:tcPr>
           <w:p>
             <w:r>
-              <w:t xml:space="preserve">Kendrick Slamat </w:t>
+              <w:t xml:space="preserve">Kendrick </w:t>
+            </w:r>
+            <w:proofErr w:type="spellStart"/>
+            <w:r>
+              <w:t>Slamat</w:t>
+            </w:r>
+            <w:proofErr w:type="spellEnd"/>
+            <w:r>
+              <w:t xml:space="preserve"> </w:t>
             </w:r>
           </w:p>
         </w:tc>
@@ -2118,7 +2126,21 @@
               <w:rPr>
                 <w:sz w:val="18"/>
               </w:rPr>
-              <w:t>Invalid TierID 'T00001' (extra zero; no such tier exists)</w:t>
+              <w:t xml:space="preserve">Invalid </w:t>
+            </w:r>
+            <w:proofErr w:type="spellStart"/>
+            <w:r>
+              <w:rPr>
+                <w:sz w:val="18"/>
+              </w:rPr>
+              <w:t>TierID</w:t>
+            </w:r>
+            <w:proofErr w:type="spellEnd"/>
+            <w:r>
+              <w:rPr>
+                <w:sz w:val="18"/>
+              </w:rPr>
+              <w:t xml:space="preserve"> 'T00001' (extra zero; no such tier exists)</w:t>
             </w:r>
           </w:p>
         </w:tc>
@@ -2172,7 +2194,35 @@
               <w:rPr>
                 <w:sz w:val="18"/>
               </w:rPr>
-              <w:t>Gender stored as 'Male'/'Female' but schema requires CHAR(1)</w:t>
+              <w:t>Gender stored as 'Male'/'Female</w:t>
+            </w:r>
+            <w:proofErr w:type="gramStart"/>
+            <w:r>
+              <w:rPr>
+                <w:sz w:val="18"/>
+              </w:rPr>
+              <w:t>'</w:t>
+            </w:r>
+            <w:proofErr w:type="gramEnd"/>
+            <w:r>
+              <w:rPr>
+                <w:sz w:val="18"/>
+              </w:rPr>
+              <w:t xml:space="preserve"> but schema requires </w:t>
+            </w:r>
+            <w:proofErr w:type="gramStart"/>
+            <w:r>
+              <w:rPr>
+                <w:sz w:val="18"/>
+              </w:rPr>
+              <w:t>CHAR(</w:t>
+            </w:r>
+            <w:proofErr w:type="gramEnd"/>
+            <w:r>
+              <w:rPr>
+                <w:sz w:val="18"/>
+              </w:rPr>
+              <w:t>1)</w:t>
             </w:r>
           </w:p>
         </w:tc>
@@ -2185,7 +2235,21 @@
               <w:rPr>
                 <w:sz w:val="18"/>
               </w:rPr>
-              <w:t>Mapped to 'M'/'F'</w:t>
+              <w:t>Mapped to 'M</w:t>
+            </w:r>
+            <w:proofErr w:type="gramStart"/>
+            <w:r>
+              <w:rPr>
+                <w:sz w:val="18"/>
+              </w:rPr>
+              <w:t>'/'</w:t>
+            </w:r>
+            <w:proofErr w:type="gramEnd"/>
+            <w:r>
+              <w:rPr>
+                <w:sz w:val="18"/>
+              </w:rPr>
+              <w:t>F'</w:t>
             </w:r>
           </w:p>
         </w:tc>
@@ -2222,11 +2286,19 @@
             <w:tcW w:w="2700" w:type="dxa"/>
           </w:tcPr>
           <w:p>
+            <w:proofErr w:type="spellStart"/>
             <w:r>
               <w:rPr>
                 <w:sz w:val="18"/>
               </w:rPr>
-              <w:t>DateOfBirth stored as datetime '1990-05-08 00:00:00' instead of a date</w:t>
+              <w:t>DateOfBirth</w:t>
+            </w:r>
+            <w:proofErr w:type="spellEnd"/>
+            <w:r>
+              <w:rPr>
+                <w:sz w:val="18"/>
+              </w:rPr>
+              <w:t xml:space="preserve"> stored as datetime '1990-05-08 00:00:00' instead of a date</w:t>
             </w:r>
           </w:p>
         </w:tc>
@@ -2280,7 +2352,21 @@
               <w:rPr>
                 <w:sz w:val="18"/>
               </w:rPr>
-              <w:t>Two contact fields (ContactNo, Email) but Member table has a single Contact column</w:t>
+              <w:t>Two contact fields (</w:t>
+            </w:r>
+            <w:proofErr w:type="spellStart"/>
+            <w:r>
+              <w:rPr>
+                <w:sz w:val="18"/>
+              </w:rPr>
+              <w:t>ContactNo</w:t>
+            </w:r>
+            <w:proofErr w:type="spellEnd"/>
+            <w:r>
+              <w:rPr>
+                <w:sz w:val="18"/>
+              </w:rPr>
+              <w:t>, Email) but Member table has a single Contact column</w:t>
             </w:r>
           </w:p>
         </w:tc>
@@ -2412,7 +2498,35 @@
               <w:rPr>
                 <w:sz w:val="18"/>
               </w:rPr>
-              <w:t>Gender stored as 'Male'/'Female' but schema requires CHAR(1)</w:t>
+              <w:t>Gender stored as 'Male'/'Female</w:t>
+            </w:r>
+            <w:proofErr w:type="gramStart"/>
+            <w:r>
+              <w:rPr>
+                <w:sz w:val="18"/>
+              </w:rPr>
+              <w:t>'</w:t>
+            </w:r>
+            <w:proofErr w:type="gramEnd"/>
+            <w:r>
+              <w:rPr>
+                <w:sz w:val="18"/>
+              </w:rPr>
+              <w:t xml:space="preserve"> but schema requires </w:t>
+            </w:r>
+            <w:proofErr w:type="gramStart"/>
+            <w:r>
+              <w:rPr>
+                <w:sz w:val="18"/>
+              </w:rPr>
+              <w:t>CHAR(</w:t>
+            </w:r>
+            <w:proofErr w:type="gramEnd"/>
+            <w:r>
+              <w:rPr>
+                <w:sz w:val="18"/>
+              </w:rPr>
+              <w:t>1)</w:t>
             </w:r>
           </w:p>
         </w:tc>
@@ -2425,7 +2539,21 @@
               <w:rPr>
                 <w:sz w:val="18"/>
               </w:rPr>
-              <w:t>Mapped to 'M'/'F'</w:t>
+              <w:t>Mapped to 'M</w:t>
+            </w:r>
+            <w:proofErr w:type="gramStart"/>
+            <w:r>
+              <w:rPr>
+                <w:sz w:val="18"/>
+              </w:rPr>
+              <w:t>'/'</w:t>
+            </w:r>
+            <w:proofErr w:type="gramEnd"/>
+            <w:r>
+              <w:rPr>
+                <w:sz w:val="18"/>
+              </w:rPr>
+              <w:t>F'</w:t>
             </w:r>
           </w:p>
         </w:tc>
@@ -2449,11 +2577,18 @@
             <w:tcW w:w="1620" w:type="dxa"/>
           </w:tcPr>
           <w:p>
+            <w:pPr>
+              <w:rPr>
+                <w:sz w:val="18"/>
+                <w:szCs w:val="18"/>
+              </w:rPr>
+            </w:pPr>
             <w:r>
               <w:rPr>
                 <w:sz w:val="18"/>
+                <w:szCs w:val="18"/>
               </w:rPr>
-              <w:t>1 row</w:t>
+              <w:t>S0028</w:t>
             </w:r>
           </w:p>
         </w:tc>
@@ -2494,62 +2629,16 @@
               <w:rPr>
                 <w:sz w:val="18"/>
               </w:rPr>
-              <w:t>staff.csv</w:t>
+              <w:t xml:space="preserve">data.xlsx / </w:t>
             </w:r>
-          </w:p>
-        </w:tc>
-        <w:tc>
-          <w:tcPr>
-            <w:tcW w:w="1620" w:type="dxa"/>
-          </w:tcPr>
-          <w:p>
+            <w:proofErr w:type="spellStart"/>
             <w:r>
               <w:rPr>
                 <w:sz w:val="18"/>
               </w:rPr>
-              <w:t>S0003</w:t>
+              <w:t>BookCopies</w:t>
             </w:r>
-          </w:p>
-        </w:tc>
-        <w:tc>
-          <w:tcPr>
-            <w:tcW w:w="2700" w:type="dxa"/>
-          </w:tcPr>
-          <w:p>
-            <w:r>
-              <w:rPr>
-                <w:sz w:val="18"/>
-              </w:rPr>
-              <w:t>'Julia Mahmud' has Gender = Male, which cannot be verified against any source</w:t>
-            </w:r>
-          </w:p>
-        </w:tc>
-        <w:tc>
-          <w:tcPr>
-            <w:tcW w:w="2994" w:type="dxa"/>
-          </w:tcPr>
-          <w:p>
-            <w:r>
-              <w:rPr>
-                <w:sz w:val="18"/>
-              </w:rPr>
-              <w:t>Left unchanged; flagged for tutor</w:t>
-            </w:r>
-          </w:p>
-        </w:tc>
-      </w:tr>
-      <w:tr>
-        <w:tc>
-          <w:tcPr>
-            <w:tcW w:w="1705" w:type="dxa"/>
-          </w:tcPr>
-          <w:p>
-            <w:r>
-              <w:rPr>
-                <w:sz w:val="18"/>
-              </w:rPr>
-              <w:t>data.xlsx / BookCopies</w:t>
-            </w:r>
+            <w:proofErr w:type="spellEnd"/>
           </w:p>
         </w:tc>
         <w:tc>
@@ -2574,7 +2663,21 @@
               <w:rPr>
                 <w:sz w:val="18"/>
               </w:rPr>
-              <w:t>Status misspelled as 'Availble'</w:t>
+              <w:t>Status misspelled as '</w:t>
+            </w:r>
+            <w:proofErr w:type="spellStart"/>
+            <w:r>
+              <w:rPr>
+                <w:sz w:val="18"/>
+              </w:rPr>
+              <w:t>Availble</w:t>
+            </w:r>
+            <w:proofErr w:type="spellEnd"/>
+            <w:r>
+              <w:rPr>
+                <w:sz w:val="18"/>
+              </w:rPr>
+              <w:t>'</w:t>
             </w:r>
           </w:p>
         </w:tc>
@@ -2602,8 +2705,16 @@
               <w:rPr>
                 <w:sz w:val="18"/>
               </w:rPr>
-              <w:t>data.xlsx / BookCopies</w:t>
+              <w:t xml:space="preserve">data.xlsx / </w:t>
             </w:r>
+            <w:proofErr w:type="spellStart"/>
+            <w:r>
+              <w:rPr>
+                <w:sz w:val="18"/>
+              </w:rPr>
+              <w:t>BookCopies</w:t>
+            </w:r>
+            <w:proofErr w:type="spellEnd"/>
           </w:p>
         </w:tc>
         <w:tc>
@@ -2682,7 +2793,63 @@
               <w:rPr>
                 <w:sz w:val="18"/>
               </w:rPr>
-              <w:t>Row references StaffID 'S0101' (staff run S0001-S0051) and CopySeqNo 8 (book has 3 copies); DueDate 2023-04-02 precedes LoanDatetime 2024-07-04</w:t>
+              <w:t xml:space="preserve">Row references </w:t>
+            </w:r>
+            <w:proofErr w:type="spellStart"/>
+            <w:r>
+              <w:rPr>
+                <w:sz w:val="18"/>
+              </w:rPr>
+              <w:t>StaffID</w:t>
+            </w:r>
+            <w:proofErr w:type="spellEnd"/>
+            <w:r>
+              <w:rPr>
+                <w:sz w:val="18"/>
+              </w:rPr>
+              <w:t xml:space="preserve"> 'S0101' (staff run S0001-S0051) and </w:t>
+            </w:r>
+            <w:proofErr w:type="spellStart"/>
+            <w:r>
+              <w:rPr>
+                <w:sz w:val="18"/>
+              </w:rPr>
+              <w:t>CopySeqNo</w:t>
+            </w:r>
+            <w:proofErr w:type="spellEnd"/>
+            <w:r>
+              <w:rPr>
+                <w:sz w:val="18"/>
+              </w:rPr>
+              <w:t xml:space="preserve"> 8 (book has 3 copies); </w:t>
+            </w:r>
+            <w:proofErr w:type="spellStart"/>
+            <w:r>
+              <w:rPr>
+                <w:sz w:val="18"/>
+              </w:rPr>
+              <w:t>DueDate</w:t>
+            </w:r>
+            <w:proofErr w:type="spellEnd"/>
+            <w:r>
+              <w:rPr>
+                <w:sz w:val="18"/>
+              </w:rPr>
+              <w:t xml:space="preserve"> 2023-04-02 precedes </w:t>
+            </w:r>
+            <w:proofErr w:type="spellStart"/>
+            <w:r>
+              <w:rPr>
+                <w:sz w:val="18"/>
+              </w:rPr>
+              <w:t>LoanDatetime</w:t>
+            </w:r>
+            <w:proofErr w:type="spellEnd"/>
+            <w:r>
+              <w:rPr>
+                <w:sz w:val="18"/>
+              </w:rPr>
+              <w:t xml:space="preserve"> 2024-07-04</w:t>
             </w:r>
           </w:p>
         </w:tc>
@@ -2711,7 +2878,15 @@
         <w:pStyle w:val="ListParagraph"/>
       </w:pPr>
       <w:r>
-        <w:t>Submit your SQL INSERT statements for data insertion to the OLTP tables in OLTP_insert.sql. If you apply bulk loading, submit each of the cleaned data files used during insertion as well.</w:t>
+        <w:t xml:space="preserve">Submit your SQL INSERT statements for data insertion to the OLTP tables in </w:t>
+      </w:r>
+      <w:proofErr w:type="spellStart"/>
+      <w:r>
+        <w:t>OLTP_insert.sql</w:t>
+      </w:r>
+      <w:proofErr w:type="spellEnd"/>
+      <w:r>
+        <w:t>. If you apply bulk loading, submit each of the cleaned data files used during insertion as well.</w:t>
       </w:r>
     </w:p>
     <w:p>
@@ -2810,10 +2985,10 @@
           <w:noProof/>
         </w:rPr>
         <w:drawing>
-          <wp:inline distT="0" distB="0" distL="0" distR="0" wp14:anchorId="1210C92F" wp14:editId="6EE4D292">
-            <wp:extent cx="6190615" cy="5516245"/>
-            <wp:effectExtent l="0" t="0" r="635" b="8255"/>
-            <wp:docPr id="301797883" name="Picture 10"/>
+          <wp:inline distT="0" distB="0" distL="0" distR="0" wp14:anchorId="0AD872B6" wp14:editId="454AEF3A">
+            <wp:extent cx="6190615" cy="5391150"/>
+            <wp:effectExtent l="0" t="0" r="635" b="0"/>
+            <wp:docPr id="1100106670" name="Picture 12"/>
             <wp:cNvGraphicFramePr>
               <a:graphicFrameLocks xmlns:a="http://schemas.openxmlformats.org/drawingml/2006/main" noChangeAspect="1"/>
             </wp:cNvGraphicFramePr>
@@ -2821,36 +2996,23 @@
               <a:graphicData uri="http://schemas.openxmlformats.org/drawingml/2006/picture">
                 <pic:pic xmlns:pic="http://schemas.openxmlformats.org/drawingml/2006/picture">
                   <pic:nvPicPr>
-                    <pic:cNvPr id="0" name="Picture 3"/>
-                    <pic:cNvPicPr>
-                      <a:picLocks noChangeAspect="1" noChangeArrowheads="1"/>
-                    </pic:cNvPicPr>
+                    <pic:cNvPr id="1100106670" name="Picture 1100106670"/>
+                    <pic:cNvPicPr/>
                   </pic:nvPicPr>
                   <pic:blipFill>
-                    <a:blip r:embed="rId12">
-                      <a:extLst>
-                        <a:ext uri="{28A0092B-C50C-407E-A947-70E740481C1C}">
-                          <a14:useLocalDpi xmlns:a14="http://schemas.microsoft.com/office/drawing/2010/main" val="0"/>
-                        </a:ext>
-                      </a:extLst>
-                    </a:blip>
-                    <a:srcRect/>
+                    <a:blip r:embed="rId12"/>
                     <a:stretch>
                       <a:fillRect/>
                     </a:stretch>
                   </pic:blipFill>
-                  <pic:spPr bwMode="auto">
+                  <pic:spPr>
                     <a:xfrm>
                       <a:off x="0" y="0"/>
-                      <a:ext cx="6190615" cy="5516245"/>
+                      <a:ext cx="6190615" cy="5391150"/>
                     </a:xfrm>
                     <a:prstGeom prst="rect">
                       <a:avLst/>
                     </a:prstGeom>
-                    <a:noFill/>
-                    <a:ln>
-                      <a:noFill/>
-                    </a:ln>
                   </pic:spPr>
                 </pic:pic>
               </a:graphicData>
@@ -2873,7 +3035,63 @@
         </w:rPr>
       </w:pPr>
       <w:r>
-        <w:t>To support the required analysis, we used a star schema centred on FactLoan. Its grain is one completed loan: one physical book copy borrowed by one member and returned. FactLoan links once to each of four dimensions: DimMember, DimStaff, DimBook and DimDate.</w:t>
+        <w:t xml:space="preserve">To support the required analysis, we used a star schema </w:t>
+      </w:r>
+      <w:proofErr w:type="spellStart"/>
+      <w:r>
+        <w:t>centred</w:t>
+      </w:r>
+      <w:proofErr w:type="spellEnd"/>
+      <w:r>
+        <w:t xml:space="preserve"> on </w:t>
+      </w:r>
+      <w:proofErr w:type="spellStart"/>
+      <w:r>
+        <w:t>FactLoan</w:t>
+      </w:r>
+      <w:proofErr w:type="spellEnd"/>
+      <w:r>
+        <w:t xml:space="preserve">. Its grain is one completed loan: one physical book copy borrowed by one member and returned. </w:t>
+      </w:r>
+      <w:proofErr w:type="spellStart"/>
+      <w:r>
+        <w:t>FactLoan</w:t>
+      </w:r>
+      <w:proofErr w:type="spellEnd"/>
+      <w:r>
+        <w:t xml:space="preserve"> links once to each of four dimensions: </w:t>
+      </w:r>
+      <w:proofErr w:type="spellStart"/>
+      <w:r>
+        <w:t>DimMember</w:t>
+      </w:r>
+      <w:proofErr w:type="spellEnd"/>
+      <w:r>
+        <w:t xml:space="preserve">, </w:t>
+      </w:r>
+      <w:proofErr w:type="spellStart"/>
+      <w:r>
+        <w:t>DimStaff</w:t>
+      </w:r>
+      <w:proofErr w:type="spellEnd"/>
+      <w:r>
+        <w:t xml:space="preserve">, </w:t>
+      </w:r>
+      <w:proofErr w:type="spellStart"/>
+      <w:r>
+        <w:t>DimBook</w:t>
+      </w:r>
+      <w:proofErr w:type="spellEnd"/>
+      <w:r>
+        <w:t xml:space="preserve"> and </w:t>
+      </w:r>
+      <w:proofErr w:type="spellStart"/>
+      <w:r>
+        <w:t>DimDate</w:t>
+      </w:r>
+      <w:proofErr w:type="spellEnd"/>
+      <w:r>
+        <w:t>.</w:t>
       </w:r>
     </w:p>
     <w:p>
@@ -2890,7 +3108,79 @@
         </w:rPr>
       </w:pPr>
       <w:r>
-        <w:t>Every table, including FactLoan and DimDate, uses an AUTO_INCREMENT surrogate key. DimMember stores the member's current TierName, TierLevel and BorrowLimit, while DimBook stores the minimum tier needed to borrow each book. These denormalised attributes keep the model in star form and reduce joins in analytical queries.</w:t>
+        <w:t xml:space="preserve">Every table, including </w:t>
+      </w:r>
+      <w:proofErr w:type="spellStart"/>
+      <w:r>
+        <w:t>FactLoan</w:t>
+      </w:r>
+      <w:proofErr w:type="spellEnd"/>
+      <w:r>
+        <w:t xml:space="preserve"> and </w:t>
+      </w:r>
+      <w:proofErr w:type="spellStart"/>
+      <w:r>
+        <w:t>DimDate</w:t>
+      </w:r>
+      <w:proofErr w:type="spellEnd"/>
+      <w:r>
+        <w:t xml:space="preserve">, uses an AUTO_INCREMENT surrogate key. </w:t>
+      </w:r>
+      <w:proofErr w:type="spellStart"/>
+      <w:r>
+        <w:t>DimMember</w:t>
+      </w:r>
+      <w:proofErr w:type="spellEnd"/>
+      <w:r>
+        <w:t xml:space="preserve"> stores the member's current </w:t>
+      </w:r>
+      <w:proofErr w:type="spellStart"/>
+      <w:r>
+        <w:t>TierName</w:t>
+      </w:r>
+      <w:proofErr w:type="spellEnd"/>
+      <w:r>
+        <w:t xml:space="preserve">, </w:t>
+      </w:r>
+      <w:proofErr w:type="spellStart"/>
+      <w:r>
+        <w:t>TierLevel</w:t>
+      </w:r>
+      <w:proofErr w:type="spellEnd"/>
+      <w:r>
+        <w:t xml:space="preserve"> and </w:t>
+      </w:r>
+      <w:proofErr w:type="spellStart"/>
+      <w:r>
+        <w:t>BorrowLimit</w:t>
+      </w:r>
+      <w:proofErr w:type="spellEnd"/>
+      <w:r>
+        <w:t xml:space="preserve">, while </w:t>
+      </w:r>
+      <w:proofErr w:type="spellStart"/>
+      <w:r>
+        <w:t>DimBook</w:t>
+      </w:r>
+      <w:proofErr w:type="spellEnd"/>
+      <w:r>
+        <w:t xml:space="preserve"> stores the minimum tier needed to borrow each book. These </w:t>
+      </w:r>
+      <w:proofErr w:type="spellStart"/>
+      <w:r>
+        <w:t>denormalised</w:t>
+      </w:r>
+      <w:proofErr w:type="spellEnd"/>
+      <w:r>
+        <w:t xml:space="preserve"> attributes keep the model in star form and reduce </w:t>
+      </w:r>
+      <w:proofErr w:type="gramStart"/>
+      <w:r>
+        <w:t>joins</w:t>
+      </w:r>
+      <w:proofErr w:type="gramEnd"/>
+      <w:r>
+        <w:t xml:space="preserve"> in analytical queries.</w:t>
       </w:r>
     </w:p>
     <w:p>
@@ -2906,9 +3196,73 @@
           <w:lang w:val="en-SG"/>
         </w:rPr>
       </w:pPr>
+      <w:proofErr w:type="spellStart"/>
+      <w:r>
+        <w:t>DimDate</w:t>
+      </w:r>
+      <w:proofErr w:type="spellEnd"/>
+      <w:r>
+        <w:t xml:space="preserve"> has day-level granularity and includes </w:t>
+      </w:r>
+      <w:proofErr w:type="spellStart"/>
+      <w:r>
+        <w:t>FullDate</w:t>
+      </w:r>
+      <w:proofErr w:type="spellEnd"/>
+      <w:r>
+        <w:t xml:space="preserve">, day of week, weekend indicator, month, quarter and year. </w:t>
+      </w:r>
+      <w:proofErr w:type="spellStart"/>
+      <w:r>
+        <w:t>FactLoan</w:t>
+      </w:r>
+      <w:proofErr w:type="spellEnd"/>
+      <w:r>
+        <w:t xml:space="preserve"> references </w:t>
+      </w:r>
+      <w:proofErr w:type="spellStart"/>
+      <w:r>
+        <w:t>DimDate</w:t>
+      </w:r>
+      <w:proofErr w:type="spellEnd"/>
+      <w:r>
+        <w:t xml:space="preserve"> once through </w:t>
+      </w:r>
+      <w:proofErr w:type="spellStart"/>
+      <w:r>
+        <w:t>BorrowDateKey</w:t>
+      </w:r>
+      <w:proofErr w:type="spellEnd"/>
+      <w:r>
+        <w:t xml:space="preserve">, which records when </w:t>
+      </w:r>
       <w:r>
         <w:lastRenderedPageBreak/>
-        <w:t>DimDate has day-level granularity and includes FullDate, day of week, weekend indicator, month, quarter and year. FactLoan references DimDate once through BorrowDateKey, which records when the loan began. Return-related analysis is supported by LoanDurationDays, DaysBeforeDue and IsLate instead of a second date-dimension relationship, so the model matches the ERD and remains easy to interpret.</w:t>
+        <w:t xml:space="preserve">the loan began. Return-related analysis is supported by </w:t>
+      </w:r>
+      <w:proofErr w:type="spellStart"/>
+      <w:r>
+        <w:t>LoanDurationDays</w:t>
+      </w:r>
+      <w:proofErr w:type="spellEnd"/>
+      <w:r>
+        <w:t xml:space="preserve">, </w:t>
+      </w:r>
+      <w:proofErr w:type="spellStart"/>
+      <w:r>
+        <w:t>DaysBeforeDue</w:t>
+      </w:r>
+      <w:proofErr w:type="spellEnd"/>
+      <w:r>
+        <w:t xml:space="preserve"> and </w:t>
+      </w:r>
+      <w:proofErr w:type="spellStart"/>
+      <w:r>
+        <w:t>IsLate</w:t>
+      </w:r>
+      <w:proofErr w:type="spellEnd"/>
+      <w:r>
+        <w:t xml:space="preserve"> instead of a second date-dimension relationship, so the model matches the ERD and remains easy to interpret.</w:t>
       </w:r>
     </w:p>
     <w:p>
@@ -2917,8 +3271,21 @@
           <w:lang w:val="en-SG"/>
         </w:rPr>
       </w:pPr>
-      <w:r>
-        <w:t>CopySeqNo is kept in FactLoan as a degenerate dimension. It identifies the physical copy involved in each loan and preserves traceability to the operational system without adding a separate, low-value dimension table.</w:t>
+      <w:proofErr w:type="spellStart"/>
+      <w:r>
+        <w:t>CopySeqNo</w:t>
+      </w:r>
+      <w:proofErr w:type="spellEnd"/>
+      <w:r>
+        <w:t xml:space="preserve"> is kept in </w:t>
+      </w:r>
+      <w:proofErr w:type="spellStart"/>
+      <w:r>
+        <w:t>FactLoan</w:t>
+      </w:r>
+      <w:proofErr w:type="spellEnd"/>
+      <w:r>
+        <w:t xml:space="preserve"> as a degenerate dimension. It identifies the physical copy involved in each loan and preserves traceability to the operational system without adding a separate, low-value dimension table.</w:t>
       </w:r>
     </w:p>
     <w:p>
@@ -2935,7 +3302,57 @@
         </w:rPr>
       </w:pPr>
       <w:r>
-        <w:t>During the load, LoanDurationDays is calculated as the difference between the borrow and return dates. DaysBeforeDue is due date minus return date, so a negative result indicates a late return. IsLate is stored as a clear Boolean flag. Persisting these measures keeps later analyses consistent and avoids repeating calculations in every query.</w:t>
+        <w:t xml:space="preserve">During the load, </w:t>
+      </w:r>
+      <w:proofErr w:type="spellStart"/>
+      <w:r>
+        <w:t>LoanDurationDays</w:t>
+      </w:r>
+      <w:proofErr w:type="spellEnd"/>
+      <w:r>
+        <w:t xml:space="preserve"> is calculated as the difference between the borrow and return dates. </w:t>
+      </w:r>
+      <w:proofErr w:type="spellStart"/>
+      <w:proofErr w:type="gramStart"/>
+      <w:r>
+        <w:t>DaysBeforeDue</w:t>
+      </w:r>
+      <w:proofErr w:type="spellEnd"/>
+      <w:proofErr w:type="gramEnd"/>
+      <w:r>
+        <w:t xml:space="preserve"> is due date minus return date, so a negative result indicates a late return. </w:t>
+      </w:r>
+      <w:proofErr w:type="spellStart"/>
+      <w:r>
+        <w:t>IsLate</w:t>
+      </w:r>
+      <w:proofErr w:type="spellEnd"/>
+      <w:r>
+        <w:t xml:space="preserve"> is stored as a clear Boolean flag. Persisting these </w:t>
+      </w:r>
+      <w:proofErr w:type="gramStart"/>
+      <w:r>
+        <w:t>measures keeps</w:t>
+      </w:r>
+      <w:proofErr w:type="gramEnd"/>
+      <w:r>
+        <w:t xml:space="preserve"> later analyses </w:t>
+      </w:r>
+      <w:proofErr w:type="gramStart"/>
+      <w:r>
+        <w:t>consistent</w:t>
+      </w:r>
+      <w:proofErr w:type="gramEnd"/>
+      <w:r>
+        <w:t xml:space="preserve"> and </w:t>
+      </w:r>
+      <w:proofErr w:type="gramStart"/>
+      <w:r>
+        <w:t>avoids</w:t>
+      </w:r>
+      <w:proofErr w:type="gramEnd"/>
+      <w:r>
+        <w:t xml:space="preserve"> repeating calculations in every query.</w:t>
       </w:r>
     </w:p>
     <w:p>
@@ -2944,8 +3361,21 @@
           <w:lang w:val="en-SG"/>
         </w:rPr>
       </w:pPr>
-      <w:r>
-        <w:t>FactLoan contains only completed loans because the project's analytical focus is borrowing activity and duration for books that have been returned; the single open loan is excluded. Slowly changing dimensions are outside scope. If membership-tier history is required later, DimMember can be extended to a Type 2 slowly changing dimension with effective-date, expiry-date and current-row attributes.</w:t>
+      <w:proofErr w:type="spellStart"/>
+      <w:r>
+        <w:t>FactLoan</w:t>
+      </w:r>
+      <w:proofErr w:type="spellEnd"/>
+      <w:r>
+        <w:t xml:space="preserve"> contains only completed loans because the project's analytical focus is borrowing activity and duration for books that have been returned; the single open loan is excluded. Slowly changing dimensions are outside scope. If membership-tier history is required later, </w:t>
+      </w:r>
+      <w:proofErr w:type="spellStart"/>
+      <w:r>
+        <w:t>DimMember</w:t>
+      </w:r>
+      <w:proofErr w:type="spellEnd"/>
+      <w:r>
+        <w:t xml:space="preserve"> can be extended to a Type 2 slowly changing dimension with effective-date, expiry-date and current-row attributes.</w:t>
       </w:r>
     </w:p>
     <w:p>
@@ -2963,13 +3393,45 @@
       </w:pPr>
       <w:r>
         <w:lastRenderedPageBreak/>
-        <w:t xml:space="preserve">Submit your CREATE table statements for DW table creations in DW_create.sql. Use appropriate SQL statements to extract and load data from OLTP tables to the </w:t>
-      </w:r>
-      <w:r>
-        <w:t>DW and</w:t>
-      </w:r>
-      <w:r>
-        <w:t xml:space="preserve"> submit all your queries in DW_insert.sql.</w:t>
+        <w:t xml:space="preserve">Submit your </w:t>
+      </w:r>
+      <w:proofErr w:type="gramStart"/>
+      <w:r>
+        <w:t>CREATE table</w:t>
+      </w:r>
+      <w:proofErr w:type="gramEnd"/>
+      <w:r>
+        <w:t xml:space="preserve"> statements for DW table creations in </w:t>
+      </w:r>
+      <w:proofErr w:type="spellStart"/>
+      <w:r>
+        <w:t>DW_create.sql</w:t>
+      </w:r>
+      <w:proofErr w:type="spellEnd"/>
+      <w:r>
+        <w:t xml:space="preserve">. Use appropriate SQL statements to extract and load data from OLTP tables to </w:t>
+      </w:r>
+      <w:proofErr w:type="gramStart"/>
+      <w:r>
+        <w:t xml:space="preserve">the </w:t>
+      </w:r>
+      <w:r>
+        <w:t>DW</w:t>
+      </w:r>
+      <w:proofErr w:type="gramEnd"/>
+      <w:r>
+        <w:t xml:space="preserve"> and</w:t>
+      </w:r>
+      <w:r>
+        <w:t xml:space="preserve"> submit all your queries in </w:t>
+      </w:r>
+      <w:proofErr w:type="spellStart"/>
+      <w:r>
+        <w:t>DW_insert.sql</w:t>
+      </w:r>
+      <w:proofErr w:type="spellEnd"/>
+      <w:r>
+        <w:t>.</w:t>
       </w:r>
     </w:p>
     <w:bookmarkEnd w:id="1"/>
@@ -3133,8 +3595,45 @@
         </w:rPr>
         <w:t xml:space="preserve">Row-count reconciliation. </w:t>
       </w:r>
-      <w:r>
-        <w:t>FactLoan contains 12,343 rows, exactly matching the number of completed Loan records in the OLTP database. The dimension counts also reconcile to their source entities: DimMember 301/Member 301, DimBook 500/Book 500 and DimStaff 51/Staff 51. DimDate contains 2,557 day-level rows. Matching counts confirm that the intended records were loaded without omission or duplication.</w:t>
+      <w:proofErr w:type="spellStart"/>
+      <w:r>
+        <w:t>FactLoan</w:t>
+      </w:r>
+      <w:proofErr w:type="spellEnd"/>
+      <w:r>
+        <w:t xml:space="preserve"> contains 12,343 rows, exactly matching the number of completed Loan records in the OLTP database. The dimension counts also reconcile to their source entities: </w:t>
+      </w:r>
+      <w:proofErr w:type="spellStart"/>
+      <w:r>
+        <w:t>DimMember</w:t>
+      </w:r>
+      <w:proofErr w:type="spellEnd"/>
+      <w:r>
+        <w:t xml:space="preserve"> 301/Member 301, </w:t>
+      </w:r>
+      <w:proofErr w:type="spellStart"/>
+      <w:r>
+        <w:t>DimBook</w:t>
+      </w:r>
+      <w:proofErr w:type="spellEnd"/>
+      <w:r>
+        <w:t xml:space="preserve"> 500/Book 500 and </w:t>
+      </w:r>
+      <w:proofErr w:type="spellStart"/>
+      <w:r>
+        <w:t>DimStaff</w:t>
+      </w:r>
+      <w:proofErr w:type="spellEnd"/>
+      <w:r>
+        <w:t xml:space="preserve"> 51/Staff 51. </w:t>
+      </w:r>
+      <w:proofErr w:type="spellStart"/>
+      <w:r>
+        <w:t>DimDate</w:t>
+      </w:r>
+      <w:proofErr w:type="spellEnd"/>
+      <w:r>
+        <w:t xml:space="preserve"> contains 2,557 day-level rows. Matching counts confirm that the intended records were loaded without omission or duplication.</w:t>
       </w:r>
     </w:p>
     <w:p>
@@ -3150,7 +3649,31 @@
         <w:t xml:space="preserve">Measure reconciliation. </w:t>
       </w:r>
       <w:r>
-        <w:t>The total loan duration calculated directly from completed OLTP loans is 108,801 days, exactly the same as the total LoanDurationDays stored in FactLoan. This confirms that the duration transformation was applied consistently to every loaded fact.</w:t>
+        <w:t xml:space="preserve">The total loan duration calculated directly from completed OLTP loans is 108,801 days, </w:t>
+      </w:r>
+      <w:proofErr w:type="gramStart"/>
+      <w:r>
+        <w:t>exactly the same</w:t>
+      </w:r>
+      <w:proofErr w:type="gramEnd"/>
+      <w:r>
+        <w:t xml:space="preserve"> as the total </w:t>
+      </w:r>
+      <w:proofErr w:type="spellStart"/>
+      <w:r>
+        <w:t>LoanDurationDays</w:t>
+      </w:r>
+      <w:proofErr w:type="spellEnd"/>
+      <w:r>
+        <w:t xml:space="preserve"> stored in </w:t>
+      </w:r>
+      <w:proofErr w:type="spellStart"/>
+      <w:r>
+        <w:t>FactLoan</w:t>
+      </w:r>
+      <w:proofErr w:type="spellEnd"/>
+      <w:r>
+        <w:t>. This confirms that the duration transformation was applied consistently to every loaded fact.</w:t>
       </w:r>
     </w:p>
     <w:p>
@@ -3161,11 +3684,35 @@
         <w:t xml:space="preserve">Referential-integrity and date-range checks. </w:t>
       </w:r>
       <w:r>
-        <w:t xml:space="preserve">A left-join validation across FactLoan and all four dimensions returns 0 orphan rows, confirming every fact points to a valid member, staff member, </w:t>
+        <w:t xml:space="preserve">A left-join validation across </w:t>
+      </w:r>
+      <w:proofErr w:type="spellStart"/>
+      <w:r>
+        <w:t>FactLoan</w:t>
+      </w:r>
+      <w:proofErr w:type="spellEnd"/>
+      <w:r>
+        <w:t xml:space="preserve"> and all four dimensions </w:t>
+      </w:r>
+      <w:proofErr w:type="gramStart"/>
+      <w:r>
+        <w:t>returns</w:t>
+      </w:r>
+      <w:proofErr w:type="gramEnd"/>
+      <w:r>
+        <w:t xml:space="preserve"> 0 orphan rows, confirming every fact points to a valid member, staff member, </w:t>
       </w:r>
       <w:r>
         <w:lastRenderedPageBreak/>
-        <w:t>book and borrow date. DimDate runs from 2020-01-01 to 2026-12-31, covering the dates required by the load. Together, these checks validate record completeness, transformed measures and dimension-key integrity. The verification SQL is included in the submitted DW scripts.</w:t>
+        <w:t xml:space="preserve">book and borrow date. </w:t>
+      </w:r>
+      <w:proofErr w:type="spellStart"/>
+      <w:r>
+        <w:t>DimDate</w:t>
+      </w:r>
+      <w:proofErr w:type="spellEnd"/>
+      <w:r>
+        <w:t xml:space="preserve"> runs from 2020-01-01 to 2026-12-31, covering the dates required by the load. Together, these checks validate record completeness, transformed measures and dimension-key integrity. The verification SQL is included in the submitted DW scripts.</w:t>
       </w:r>
     </w:p>
     <w:bookmarkEnd w:id="0"/>
@@ -3193,7 +3740,15 @@
         </w:numPr>
       </w:pPr>
       <w:r>
-        <w:t xml:space="preserve">Describe and discuss your analysis done using the DW. </w:t>
+        <w:t xml:space="preserve">Describe and discuss your analysis done using </w:t>
+      </w:r>
+      <w:proofErr w:type="gramStart"/>
+      <w:r>
+        <w:t>the DW</w:t>
+      </w:r>
+      <w:proofErr w:type="gramEnd"/>
+      <w:r>
+        <w:t xml:space="preserve">. </w:t>
       </w:r>
       <w:r>
         <w:t>Briefly e</w:t>
@@ -3220,7 +3775,15 @@
         <w:t xml:space="preserve"> if group size is 4.</w:t>
       </w:r>
       <w:r>
-        <w:t xml:space="preserve"> Separately submit all your queries in DW_query.sql. (So do not include </w:t>
+        <w:t xml:space="preserve"> Separately submit all your queries in </w:t>
+      </w:r>
+      <w:proofErr w:type="spellStart"/>
+      <w:r>
+        <w:t>DW_query.sql</w:t>
+      </w:r>
+      <w:proofErr w:type="spellEnd"/>
+      <w:r>
+        <w:t xml:space="preserve">. (So do not include </w:t>
       </w:r>
       <w:r>
         <w:t>your</w:t>
@@ -3267,8 +3830,13 @@
         </w:rPr>
         <w:t xml:space="preserve">Objective: </w:t>
       </w:r>
-      <w:r>
-        <w:t xml:space="preserve">Analyse completed-loan volume by month and </w:t>
+      <w:proofErr w:type="spellStart"/>
+      <w:r>
+        <w:t>Analyse</w:t>
+      </w:r>
+      <w:proofErr w:type="spellEnd"/>
+      <w:r>
+        <w:t xml:space="preserve"> completed-loan volume by month and </w:t>
       </w:r>
       <w:r>
         <w:t>year and</w:t>
@@ -3443,7 +4011,15 @@
         <w:t xml:space="preserve">Results: </w:t>
       </w:r>
       <w:r>
-        <w:t>Research Journal has the highest total volume at 2,093 loans across 96 titles, or 21.8 loans per title. Young Adult has the highest demand per title at 31.2 loans across 39 titles. Children is also strong, with 1,873 loans and 28.0 loans per title. Average duration is similar across the reported genres, at 8.35-9.25 days.</w:t>
+        <w:t xml:space="preserve">Research Journal has the highest total volume at 2,093 loans across 96 titles, or 21.8 loans per title. Young Adult has the highest demand per title at 31.2 loans across 39 titles. Children </w:t>
+      </w:r>
+      <w:proofErr w:type="gramStart"/>
+      <w:r>
+        <w:t>is</w:t>
+      </w:r>
+      <w:proofErr w:type="gramEnd"/>
+      <w:r>
+        <w:t xml:space="preserve"> also strong, with 1,873 loans and 28.0 loans per title. Average duration is similar across the reported genres, at 8.35-9.25 days.</w:t>
       </w:r>
     </w:p>
     <w:p>
@@ -3610,7 +4186,15 @@
         <w:t xml:space="preserve">Insight: </w:t>
       </w:r>
       <w:r>
-        <w:t>In this dataset, higher-tier members keep books slightly longer but have lower late-return rates. This is an association, not proof that tier causes return behaviour. Reminders and late-return interventions would have the greatest effect when directed at Basic members.</w:t>
+        <w:t xml:space="preserve">In this dataset, higher-tier members keep books slightly longer but have lower late-return rates. This is an association, not proof that tier causes return </w:t>
+      </w:r>
+      <w:proofErr w:type="spellStart"/>
+      <w:r>
+        <w:t>behaviour</w:t>
+      </w:r>
+      <w:proofErr w:type="spellEnd"/>
+      <w:r>
+        <w:t>. Reminders and late-return interventions would have the greatest effect when directed at Basic members.</w:t>
       </w:r>
     </w:p>
     <w:p>
@@ -3688,7 +4272,15 @@
         <w:t xml:space="preserve">Insight: </w:t>
       </w:r>
       <w:r>
-        <w:t>Youth borrowing is strongly seasonal and is concentrated in the November-December school-holiday period. The library should schedule programmes, acquisitions and extra copies of popular youth titles before the fourth quarter.</w:t>
+        <w:t xml:space="preserve">Youth borrowing is strongly seasonal and is concentrated in the November-December school-holiday period. The library should schedule </w:t>
+      </w:r>
+      <w:proofErr w:type="spellStart"/>
+      <w:r>
+        <w:t>programmes</w:t>
+      </w:r>
+      <w:proofErr w:type="spellEnd"/>
+      <w:r>
+        <w:t>, acquisitions and extra copies of popular youth titles before the fourth quarter.</w:t>
       </w:r>
     </w:p>
     <w:p>
@@ -3825,7 +4417,15 @@
         <w:t xml:space="preserve">Results: </w:t>
       </w:r>
       <w:r>
-        <w:t>Of 12,343 completed loans, 11,298 (91.53%) were returned on time or early. Late loans were split into 189 returned 1-3 days late (1.53%), 205 returned 4-7 days late (1.66%), and 651 returned 8 or more days late (5.27%). The average loan duration rises from 7.37 days for on-time or early loans to 28.50 days for loans returned 8 or more days late.</w:t>
+        <w:t xml:space="preserve">Of 12,343 completed loans, 11,298 (91.53%) were returned on time or </w:t>
+      </w:r>
+      <w:proofErr w:type="gramStart"/>
+      <w:r>
+        <w:t>early</w:t>
+      </w:r>
+      <w:proofErr w:type="gramEnd"/>
+      <w:r>
+        <w:t>. Late loans were split into 189 returned 1-3 days late (1.53%), 205 returned 4-7 days late (1.66%), and 651 returned 8 or more days late (5.27%). The average loan duration rises from 7.37 days for on-time or early loans to 28.50 days for loans returned 8 or more days late.</w:t>
       </w:r>
     </w:p>
     <w:p>
@@ -3842,7 +4442,15 @@
         <w:t xml:space="preserve">Insight: </w:t>
       </w:r>
       <w:r>
-        <w:t>Most loans are returned on time, but the 8-or-more-days-late band is the largest late-return category. This group should be the priority for targeted reminders and follow-up, while shorter delays may be handled with lighter-touch interventions.</w:t>
+        <w:t xml:space="preserve">Most loans are returned on time, but the 8-or-more-days-late band is the largest late-return category. This group should be the priority for targeted reminders and follow-up, while shorter delays may be handled with </w:t>
+      </w:r>
+      <w:proofErr w:type="gramStart"/>
+      <w:r>
+        <w:t>lighter-touch</w:t>
+      </w:r>
+      <w:proofErr w:type="gramEnd"/>
+      <w:r>
+        <w:t xml:space="preserve"> interventions.</w:t>
       </w:r>
     </w:p>
     <w:sectPr>

</xml_diff>

<commit_message>
indiv report now in "final_reports" changed so it doesnt have colour and has no ai dec at the end
</commit_message>
<xml_diff>
--- a/2B21-04_group_submission_revised.docx
+++ b/2B21-04_group_submission_revised.docx
@@ -95,6 +95,36 @@
             </w:pict>
           </mc:Fallback>
         </mc:AlternateContent>
+      </w:r>
+      <w:r>
+        <w:rPr>
+          <w:rFonts w:eastAsia="Times New Roman" w:cs="Times New Roman"/>
+          <w:noProof/>
+          <w:sz w:val="24"/>
+          <w:szCs w:val="24"/>
+          <w:lang w:eastAsia="en-SG" w:bidi="th-TH"/>
+        </w:rPr>
+        <w:tab/>
+      </w:r>
+      <w:r>
+        <w:rPr>
+          <w:rFonts w:eastAsia="Times New Roman" w:cs="Times New Roman"/>
+          <w:noProof/>
+          <w:sz w:val="24"/>
+          <w:szCs w:val="24"/>
+          <w:lang w:eastAsia="en-SG" w:bidi="th-TH"/>
+        </w:rPr>
+        <w:tab/>
+      </w:r>
+      <w:r>
+        <w:rPr>
+          <w:rFonts w:eastAsia="Times New Roman" w:cs="Times New Roman"/>
+          <w:noProof/>
+          <w:sz w:val="24"/>
+          <w:szCs w:val="24"/>
+          <w:lang w:eastAsia="en-SG" w:bidi="th-TH"/>
+        </w:rPr>
+        <w:tab/>
       </w:r>
     </w:p>
     <w:tbl>

</xml_diff>